<commit_message>
Docs et Blueprint à jour (jardin vivant, UTC, rétention, pubs) ; rosée au clavier ; marges petits écrans
- PRODUCTION_PROGRESS.md §4e (jardin vivant, rétention, pubs, refonte,
  performance), plan de mesure, tests, limites ; CLAUDE.md (A6, E5, T2,
  dates UTC, test-dom, règles d'aide contextuelle et de migration) ;
  ONBOARDING.md (aides contextuelles).
- Master Blueprint : section 49 « état réel du jeu au 1er octobre 2026 ».
- Jardin : Entrée/Espace cueille une goutte du coin affiché (clavier).
- Accueil : la fenêtre du jardin suit la marge des petits écrans.

Co-Authored-By: Claude Opus 5.5 <noreply@anthropic.com>
Claude-Session: https://claude.ai/code/session_01W5hjjDD9vqQD8t6eQqX2ek
</commit_message>
<xml_diff>
--- a/docs/BlockCraft_Daily_Master_Blueprint.docx
+++ b/docs/BlockCraft_Daily_Master_Blueprint.docx
@@ -9,6 +9,14 @@
       </w:pPr>
       <w:r>
         <w:t>BLOCKCRAFT DAILY — MASTER BLUEPRINT</w:t>
+      </w:r>
+    </w:p>
+    <w:p>
+      <w:pPr>
+        <w:jc w:val="center"/>
+      </w:pPr>
+      <w:r>
+        <w:t xml:space="preserve">Mise à jour du 1er octobre 2026 : le jeu s'appelle Seedrift. L'état réel du jeu (Jardin vivant, rétention, monétisation, direction artistique, tests) est décrit en section 49.</w:t>
       </w:r>
     </w:p>
     <w:p>
@@ -9215,6 +9223,428 @@
     <w:p>
       <w:r>
         <w:t>Document maître — BlockCraft Daily — version de travail 1.0</w:t>
+      </w:r>
+    </w:p>
+    <w:p>
+      <w:pPr>
+        <w:pStyle w:val="Heading1"/>
+      </w:pPr>
+      <w:r>
+        <w:t xml:space="preserve">49. MISE À JOUR DU 1er OCTOBRE 2026 — ÉTAT RÉEL DU JEU (SEEDRIFT)</w:t>
+      </w:r>
+    </w:p>
+    <w:p>
+      <w:r>
+        <w:t xml:space="preserve">Cette section décrit ce qui existe réellement dans le jeu à cette date. Elle complète les sections 0 à 48 sans les réécrire : ces sections restent la référence de conception. Le jeu s'appelle désormais Seedrift (ex-BlockCraft Daily) ; les identifiants internes gardent le préfixe bcd. Suivi détaillé : PRODUCTION_PROGRESS.md (dépôt).</w:t>
+      </w:r>
+    </w:p>
+    <w:p>
+      <w:pPr>
+        <w:pStyle w:val="Heading2"/>
+      </w:pPr>
+      <w:r>
+        <w:t xml:space="preserve">49.1 Contenu et cœur du jeu</w:t>
+      </w:r>
+    </w:p>
+    <w:p>
+      <w:pPr>
+        <w:pStyle w:val="ListBullet"/>
+      </w:pPr>
+      <w:r>
+        <w:t xml:space="preserve">Un seul fichier HTML autonome (PWA installable, jouable hors ligne), aucun serveur : tout est stocké sur l'appareil.</w:t>
+      </w:r>
+    </w:p>
+    <w:p>
+      <w:pPr>
+        <w:pStyle w:val="ListBullet"/>
+      </w:pPr>
+      <w:r>
+        <w:t xml:space="preserve">60 niveaux sur 8 mondes (Le Jardin, Les Cailloux, Les Impasses, Le Givre, Les Passages, Les Courants, Les Ruines, Les Failles), tous validés par le solveur interne (solvables, par exact). Les mondes 9 et 10 du §5 ne sont pas faits.</w:t>
+      </w:r>
+    </w:p>
+    <w:p>
+      <w:pPr>
+        <w:pStyle w:val="ListBullet"/>
+      </w:pPr>
+      <w:r>
+        <w:t xml:space="preserve">Annuler gratuit et illimité, détection d'impasse prouvée, indice à paliers, fantôme du meilleur essai.</w:t>
+      </w:r>
+    </w:p>
+    <w:p>
+      <w:pPr>
+        <w:pStyle w:val="ListBullet"/>
+      </w:pPr>
+      <w:r>
+        <w:t xml:space="preserve">Défi du jour généré à partir de la date (même plateau pour tous), avec une règle par jour de la semaine ; le Sentier, mode infini de maîtrise (Chrono 3 min et Zen) généré et validé par le solveur.</w:t>
+      </w:r>
+    </w:p>
+    <w:p>
+      <w:pPr>
+        <w:pStyle w:val="ListBullet"/>
+      </w:pPr>
+      <w:r>
+        <w:t xml:space="preserve">Tutoriel joué avec Germain, la graine-mascotte : intro de 10 à 15 s, niveau 1 guidé, mini-scènes des mécaniques, visite des onglets avec cadeau, « Passer » toujours visible.</w:t>
+      </w:r>
+    </w:p>
+    <w:p>
+      <w:pPr>
+        <w:pStyle w:val="Heading2"/>
+      </w:pPr>
+      <w:r>
+        <w:t xml:space="preserve">49.2 Le Jardin vivant (méta-progression, cœur visuel)</w:t>
+      </w:r>
+    </w:p>
+    <w:p>
+      <w:r>
+        <w:t xml:space="preserve">Décision : la méta-progression du §9 prend la forme d'un jardin de nuit à réveiller (leçon Royal Match de l'étude : la méta la plus simple à comprendre visuellement retient le mieux).</w:t>
+      </w:r>
+    </w:p>
+    <w:p>
+      <w:pPr>
+        <w:pStyle w:val="ListBullet"/>
+      </w:pPr>
+      <w:r>
+        <w:rPr>
+          <w:b/>
+        </w:rPr>
+        <w:t xml:space="preserve">Panorama : </w:t>
+      </w:r>
+      <w:r>
+        <w:t xml:space="preserve">5 tableaux (Portail, Fontaine, Potager, Serre, Grand Arbre) qu'on fait défiler, avec des plans de profondeur, un ciel à l'heure du joueur (aube, jour, crépuscule, nuit) et une météo du jour commune à tous.</w:t>
+      </w:r>
+    </w:p>
+    <w:p>
+      <w:pPr>
+        <w:pStyle w:val="ListBullet"/>
+      </w:pPr>
+      <w:r>
+        <w:rPr>
+          <w:b/>
+        </w:rPr>
+        <w:t xml:space="preserve">Rosée : </w:t>
+      </w:r>
+      <w:r>
+        <w:t xml:space="preserve">monnaie de progression gagnée en jouant (étoiles nouvelles, défi du jour, rituel, Sentier, rosée du matin), jamais achetable ; 25 chantiers pour 720 rosées au total.</w:t>
+      </w:r>
+    </w:p>
+    <w:p>
+      <w:pPr>
+        <w:pStyle w:val="ListBullet"/>
+      </w:pPr>
+      <w:r>
+        <w:rPr>
+          <w:b/>
+        </w:rPr>
+        <w:t xml:space="preserve">Plantes des mondes : </w:t>
+      </w:r>
+      <w:r>
+        <w:t xml:space="preserve">8 espèces, 5 stades chacune ; elles grandissent avec les niveaux terminés et fleurissent avec toutes les étoiles du monde.</w:t>
+      </w:r>
+    </w:p>
+    <w:p>
+      <w:pPr>
+        <w:pStyle w:val="ListBullet"/>
+      </w:pPr>
+      <w:r>
+        <w:rPr>
+          <w:b/>
+        </w:rPr>
+        <w:t xml:space="preserve">Régularité visible : </w:t>
+      </w:r>
+      <w:r>
+        <w:t xml:space="preserve">rosée du matin à cueillir chaque jour (plus avec la série), guirlande de 7 lanternes pour les 7 derniers défis, une étoile dans le ciel de nuit par étoile gagnée. Rien ne fane jamais : pas de reproche visuel.</w:t>
+      </w:r>
+    </w:p>
+    <w:p>
+      <w:pPr>
+        <w:pStyle w:val="ListBullet"/>
+      </w:pPr>
+      <w:r>
+        <w:rPr>
+          <w:b/>
+        </w:rPr>
+        <w:t xml:space="preserve">Moments de récompense : </w:t>
+      </w:r>
+      <w:r>
+        <w:t xml:space="preserve">chantier réveillé (zoom, éclat, pétales), plante qui grandit (rejoué au jardin et montré à l'écran de victoire), zone réveillée (fête et animal qui s'installe).</w:t>
+      </w:r>
+    </w:p>
+    <w:p>
+      <w:pPr>
+        <w:pStyle w:val="Heading2"/>
+      </w:pPr>
+      <w:r>
+        <w:t xml:space="preserve">49.3 Rétention : boucles quotidiennes, hebdomadaires et longues</w:t>
+      </w:r>
+    </w:p>
+    <w:p>
+      <w:pPr>
+        <w:pStyle w:val="ListBullet"/>
+      </w:pPr>
+      <w:r>
+        <w:rPr>
+          <w:b/>
+        </w:rPr>
+        <w:t xml:space="preserve">Quotidien : </w:t>
+      </w:r>
+      <w:r>
+        <w:t xml:space="preserve">défi du jour, rituel (3 missions et un coffre), rosée du matin, lanterne du jour.</w:t>
+      </w:r>
+    </w:p>
+    <w:p>
+      <w:pPr>
+        <w:pStyle w:val="ListBullet"/>
+      </w:pPr>
+      <w:r>
+        <w:rPr>
+          <w:b/>
+        </w:rPr>
+        <w:t xml:space="preserve">Série (§9.3 « indulgente ») : </w:t>
+      </w:r>
+      <w:r>
+        <w:t xml:space="preserve">gel de série (coins) ; rattrapage : rejouer le défi d'hier sauve la série (gratuit une fois tous les 7 jours, sinon par une pub récompensée, jamais obligatoire) ; la série affichée n'est jamais une série déjà perdue.</w:t>
+      </w:r>
+    </w:p>
+    <w:p>
+      <w:pPr>
+        <w:pStyle w:val="ListBullet"/>
+      </w:pPr>
+      <w:r>
+        <w:rPr>
+          <w:b/>
+        </w:rPr>
+        <w:t xml:space="preserve">Hebdomadaire : </w:t>
+      </w:r>
+      <w:r>
+        <w:t xml:space="preserve">coffre de la semaine (5 défis sur 7).</w:t>
+      </w:r>
+    </w:p>
+    <w:p>
+      <w:pPr>
+        <w:pStyle w:val="ListBullet"/>
+      </w:pPr>
+      <w:r>
+        <w:rPr>
+          <w:b/>
+        </w:rPr>
+        <w:t xml:space="preserve">Long terme : </w:t>
+      </w:r>
+      <w:r>
+        <w:t xml:space="preserve">rangs du jardinier, 8 paliers à barème absolu (étoiles, chantiers, défis, solutions parfaites, record de série, succès) : une « Ligue Fantôme » honnête, sans aucun joueur simulé (§14).</w:t>
+      </w:r>
+    </w:p>
+    <w:p>
+      <w:pPr>
+        <w:pStyle w:val="ListBullet"/>
+      </w:pPr>
+      <w:r>
+        <w:rPr>
+          <w:b/>
+        </w:rPr>
+        <w:t xml:space="preserve">Retour : </w:t>
+      </w:r>
+      <w:r>
+        <w:t xml:space="preserve">après 3 jours d'absence, un cadeau de rosée et un mot de Germain, sans culpabiliser.</w:t>
+      </w:r>
+    </w:p>
+    <w:p>
+      <w:pPr>
+        <w:pStyle w:val="ListBullet"/>
+      </w:pPr>
+      <w:r>
+        <w:rPr>
+          <w:b/>
+        </w:rPr>
+        <w:t xml:space="preserve">Aides contextuelles : </w:t>
+      </w:r>
+      <w:r>
+        <w:t xml:space="preserve">chaque nouveauté s'explique une fois, au moment où elle apparaît, et peut toujours être passée.</w:t>
+      </w:r>
+    </w:p>
+    <w:p>
+      <w:pPr>
+        <w:pStyle w:val="Heading2"/>
+      </w:pPr>
+      <w:r>
+        <w:t xml:space="preserve">49.4 Monétisation (§30) : état</w:t>
+      </w:r>
+    </w:p>
+    <w:p>
+      <w:pPr>
+        <w:pStyle w:val="ListBullet"/>
+      </w:pPr>
+      <w:r>
+        <w:t xml:space="preserve">Pubs récompensées uniquement, derrière un bouton marqué « PUB », plafonnées (par emplacement, 8 par jour, 20 s d'écart) : doubler une victoire, indice, arrosage, second coffre, Sentier, rattrapage de série, seconde rosée.</w:t>
+      </w:r>
+    </w:p>
+    <w:p>
+      <w:pPr>
+        <w:pStyle w:val="ListBullet"/>
+      </w:pPr>
+      <w:r>
+        <w:t xml:space="preserve">Fournisseur simulé pour l'instant ; contrat prêt pour une vraie régie (AdMob via Capacitor, ou SDK d'un portail web).</w:t>
+      </w:r>
+    </w:p>
+    <w:p>
+      <w:pPr>
+        <w:pStyle w:val="ListBullet"/>
+      </w:pPr>
+      <w:r>
+        <w:t xml:space="preserve">Points d'accroche : showRewardedAd (avec repli si aucune pub n'est prête) et showInterstitial, désactivé par défaut, avec des règles prêtes (jamais avant 12 niveaux, une pause sur 4, 5 minutes d'écart, 3 par jour) conformément à l'étude (§7 : pas d'interstitiels agressifs).</w:t>
+      </w:r>
+    </w:p>
+    <w:p>
+      <w:pPr>
+        <w:pStyle w:val="ListBullet"/>
+      </w:pPr>
+      <w:r>
+        <w:t xml:space="preserve">Coins : cosmétiques, indices et gel de série uniquement. Aucun pay-to-win ; la rosée ne s'achète pas.</w:t>
+      </w:r>
+    </w:p>
+    <w:p>
+      <w:pPr>
+        <w:pStyle w:val="Heading2"/>
+      </w:pPr>
+      <w:r>
+        <w:t xml:space="preserve">49.5 Direction artistique (§18-20) : état</w:t>
+      </w:r>
+    </w:p>
+    <w:p>
+      <w:pPr>
+        <w:pStyle w:val="ListBullet"/>
+      </w:pPr>
+      <w:r>
+        <w:t xml:space="preserve">« Jardin de nuit lumineux » : verts profonds, crème, or réservé aux récompenses ; bois pour les actions, verre pour la lumière (son).</w:t>
+      </w:r>
+    </w:p>
+    <w:p>
+      <w:pPr>
+        <w:pStyle w:val="ListBullet"/>
+      </w:pPr>
+      <w:r>
+        <w:t xml:space="preserve">Plateau en relief (dalles biseautées, murs de pierre, rochers polis, graine brillante, lumière de la cible), poussière à l'impact et compression à l'arrêt.</w:t>
+      </w:r>
+    </w:p>
+    <w:p>
+      <w:pPr>
+        <w:pStyle w:val="ListBullet"/>
+      </w:pPr>
+      <w:r>
+        <w:t xml:space="preserve">Chaque monde a son décor, sa lumière et ses particules (neige du Givre, braises des Ruines, failles lumineuses…).</w:t>
+      </w:r>
+    </w:p>
+    <w:p>
+      <w:pPr>
+        <w:pStyle w:val="ListBullet"/>
+      </w:pPr>
+      <w:r>
+        <w:t xml:space="preserve">Écrans cohérents : accueil avec une fenêtre vivante sur le jardin, carte des mondes avec la plante de chaque monde, victoire avec la plante qui grandit, profil avec rang et collection.</w:t>
+      </w:r>
+    </w:p>
+    <w:p>
+      <w:pPr>
+        <w:pStyle w:val="ListBullet"/>
+      </w:pPr>
+      <w:r>
+        <w:t xml:space="preserve">60 images par seconde mesurées sur processeur ralenti ×4 ; tout en CSS, SVG et WebAudio, sans dépendance.</w:t>
+      </w:r>
+    </w:p>
+    <w:p>
+      <w:pPr>
+        <w:pStyle w:val="Heading2"/>
+      </w:pPr>
+      <w:r>
+        <w:t xml:space="preserve">49.6 Données, dates et qualité (§21-25)</w:t>
+      </w:r>
+    </w:p>
+    <w:p>
+      <w:pPr>
+        <w:pStyle w:val="ListBullet"/>
+      </w:pPr>
+      <w:r>
+        <w:t xml:space="preserve">Sauvegardes versionnées avec migrations (le jardin est passé au schéma 2 sans perte) ; données corrompues remplacées par des valeurs saines.</w:t>
+      </w:r>
+    </w:p>
+    <w:p>
+      <w:pPr>
+        <w:pStyle w:val="ListBullet"/>
+      </w:pPr>
+      <w:r>
+        <w:t xml:space="preserve">Toutes les dates sont en UTC : un seul « nouveau jour » pour tout le monde (en France, à 1 h ou 2 h du matin). Les anciennes sauvegardes en heure locale sont reprises sans casser la série.</w:t>
+      </w:r>
+    </w:p>
+    <w:p>
+      <w:pPr>
+        <w:pStyle w:val="ListBullet"/>
+      </w:pPr>
+      <w:r>
+        <w:t xml:space="preserve">Tests automatisés : solveur sur les 60 niveaux, plus de 6 600 vérifications de logique pure, une suite jsdom avec de vrais événements clavier et tactiles (nouveau joueur, ancienne sauvegarde, dates UTC, rattrapage, pubs), deux parcours complets dans Chromium. Intégration continue sur chaque modification.</w:t>
+      </w:r>
+    </w:p>
+    <w:p>
+      <w:pPr>
+        <w:pStyle w:val="Heading2"/>
+      </w:pPr>
+      <w:r>
+        <w:t xml:space="preserve">49.7 Ce qui reste à faire</w:t>
+      </w:r>
+    </w:p>
+    <w:p>
+      <w:pPr>
+        <w:pStyle w:val="ListBullet"/>
+      </w:pPr>
+      <w:r>
+        <w:t xml:space="preserve">Tests avec de vrais joueurs (5 à 10) et lecture du rapport de rétention local, pour calibrer la difficulté, le Sentier et le rythme du jardin ; vérifier que les joueurs trouvent la rosée et font défiler le jardin.</w:t>
+      </w:r>
+    </w:p>
+    <w:p>
+      <w:pPr>
+        <w:pStyle w:val="ListBullet"/>
+      </w:pPr>
+      <w:r>
+        <w:t xml:space="preserve">Vérifier l'installation et le rendu sur de vrais téléphones (iOS Safari, Android ancien).</w:t>
+      </w:r>
+    </w:p>
+    <w:p>
+      <w:pPr>
+        <w:pStyle w:val="ListBullet"/>
+      </w:pPr>
+      <w:r>
+        <w:t xml:space="preserve">Brancher une vraie régie publicitaire ; décider (ou non) d'activer l'interstitiel, en mesurant son effet sur J7.</w:t>
+      </w:r>
+    </w:p>
+    <w:p>
+      <w:pPr>
+        <w:pStyle w:val="ListBullet"/>
+      </w:pPr>
+      <w:r>
+        <w:t xml:space="preserve">Mondes 9-10 et nouvelles mécaniques (moteur, solveur, aperçu d'indice et générateur, selon la règle des quatre endroits).</w:t>
+      </w:r>
+    </w:p>
+    <w:p>
+      <w:pPr>
+        <w:pStyle w:val="ListBullet"/>
+      </w:pPr>
+      <w:r>
+        <w:t xml:space="preserve">Tout ce qui exige un serveur reste hors périmètre : éditeur partagé (§31), classements réels (§14), notifications.</w:t>
+      </w:r>
+    </w:p>
+    <w:p>
+      <w:pPr>
+        <w:pStyle w:val="ListBullet"/>
+      </w:pPr>
+      <w:r>
+        <w:t xml:space="preserve">Un illustrateur pour l'icône, les plantes et les animaux du jardin (aujourd'hui dessinés par du code).</w:t>
+      </w:r>
+    </w:p>
+    <w:p>
+      <w:r>
+        <w:t xml:space="preserve"/>
+      </w:r>
+    </w:p>
+    <w:p>
+      <w:r>
+        <w:t xml:space="preserve">Document maître — Seedrift (ex-BlockCraft Daily) — version de travail 1.1 (mise à jour du 1er octobre 2026)</w:t>
       </w:r>
     </w:p>
     <w:sectPr>

</xml_diff>

<commit_message>
Refonte « Verger au soleil » : finitions, icône sur ciel bleu, cibles tactiles, docs et Blueprint
- Icône : Germain sur un ciel bleu au lieu du vert foncé (tous les formats
  réexportés) ; manifest et theme-color en crème ; barre de statut iOS
  à texte sombre ; cache du service worker incrémenté.
- Contrastes : corail, ciel, rouge et libellés des onglets assombris ;
  chips du jardin lisibles et qui ne se chevauchent plus ; en-tête de
  JOUER complet à 360 px.
- Cibles tactiles de 44 px au moins (aide, paramètres, rosée, boutons
  « Récupérer »).
- Tests jsdom : chemin parfait, sauvegarde d'avant la refonte
  (cosmétiques et pièces conservés, annonce du nouveau look une fois).
- Docs : direction artistique dans CLAUDE.md, §4g de PRODUCTION_PROGRESS,
  visites du tutoriel dans ONBOARDING, choix de l'icône dans ICON.md,
  §51 du Master Blueprint (version 1.3).

Co-Authored-By: Claude Opus 5.5 <noreply@anthropic.com>
Claude-Session: https://claude.ai/code/session_01W5hjjDD9vqQD8t6eQqX2ek
</commit_message>
<xml_diff>
--- a/docs/BlockCraft_Daily_Master_Blueprint.docx
+++ b/docs/BlockCraft_Daily_Master_Blueprint.docx
@@ -9859,13 +9859,338 @@
       </w:r>
     </w:p>
     <w:p>
+      <w:pPr>
+        <w:pStyle w:val="Heading1"/>
+      </w:pPr>
+      <w:r>
+        <w:t xml:space="preserve">51. MISE À JOUR D'OCTOBRE 2026 — REFONTE DU DESIGN « VERGER AU SOLEIL »</w:t>
+      </w:r>
+    </w:p>
+    <w:p>
+      <w:r>
+        <w:t xml:space="preserve">Cette section remplace la §18 (direction artistique) pour tout ce qui touche à l'apparence, et complète la §20 (game feel) et la §17 (tutoriel). Elle ne change aucune règle du puzzle : aucun niveau, aucune mécanique, ni le moteur, ni le solveur n'ont été modifiés ; les 60 solutions rejouées dans le vrai moteur gagnent toujours en exactement « par » coups.</w:t>
+      </w:r>
+    </w:p>
+    <w:p>
+      <w:pPr>
+        <w:pStyle w:val="Heading2"/>
+      </w:pPr>
+      <w:r>
+        <w:t xml:space="preserve">51.1 Pourquoi</w:t>
+      </w:r>
+    </w:p>
+    <w:p>
+      <w:pPr>
+        <w:pStyle w:val="ListBullet"/>
+      </w:pPr>
+      <w:r>
+        <w:t xml:space="preserve">L'ancien visuel reposait sur un vert foncé partout (fond, cartes, plateau, icône), avec des surfaces plates et semblables : peu de hiérarchie, peu de matière, et des mécaniques distinguées surtout par la couleur.</w:t>
+      </w:r>
+    </w:p>
+    <w:p>
+      <w:pPr>
+        <w:pStyle w:val="ListBullet"/>
+      </w:pPr>
+      <w:r>
+        <w:t xml:space="preserve">Objectif : un jeu compris au premier coup d'œil, accessible aux enfants comme aux adultes, chaleureux, et reconnaissable entre mille.</w:t>
+      </w:r>
+    </w:p>
+    <w:p>
+      <w:pPr>
+        <w:pStyle w:val="Heading2"/>
+      </w:pPr>
+      <w:r>
+        <w:t xml:space="preserve">51.2 La direction artistique</w:t>
+      </w:r>
+    </w:p>
+    <w:p>
+      <w:pPr>
+        <w:pStyle w:val="ListBullet"/>
+      </w:pPr>
+      <w:r>
+        <w:t xml:space="preserve">Un verger en plein jour : fond crème et pêche baigné d'un halo de soleil, collines douces aux couleurs du monde, pollen qui flotte.</w:t>
+      </w:r>
+    </w:p>
+    <w:p>
+      <w:pPr>
+        <w:pStyle w:val="ListBullet"/>
+      </w:pPr>
+      <w:r>
+        <w:t xml:space="preserve">Palette centralisée en variables CSS : crème (fond), prune profond (texte, jamais de noir pur), corail (action principale), lagon, soleil (récompenses), ciel (information), baie (rareté épique), feuille (réussite). Le vert n'est plus qu'un accent.</w:t>
+      </w:r>
+    </w:p>
+    <w:p>
+      <w:pPr>
+        <w:pStyle w:val="ListBullet"/>
+      </w:pPr>
+      <w:r>
+        <w:t xml:space="preserve">Matière « pâte à modeler » : bord épais plus sombre en dessous, ombre douce et tiède, reflet en haut ; un bouton pressé s'enfonce. Rayons généreux, apparitions sur un ressort.</w:t>
+      </w:r>
+    </w:p>
+    <w:p>
+      <w:pPr>
+        <w:pStyle w:val="ListBullet"/>
+      </w:pPr>
+      <w:r>
+        <w:t xml:space="preserve">Typographie : Baloo 2 pour les titres (ronde, épaisse), Nunito pour le texte, repli sur la police du système.</w:t>
+      </w:r>
+    </w:p>
+    <w:p>
+      <w:pPr>
+        <w:pStyle w:val="ListBullet"/>
+      </w:pPr>
+      <w:r>
+        <w:t xml:space="preserve">Inspirations, sans copie : Royal Match et Homescapes (relief, récompense), Monument Valley et Alto (lumière, dégradés), Two Dots (formes lisibles), Gardenscapes (le jardin).</w:t>
+      </w:r>
+    </w:p>
+    <w:p>
+      <w:pPr>
+        <w:pStyle w:val="ListBullet"/>
+      </w:pPr>
+      <w:r>
+        <w:t xml:space="preserve">Icône : Germain sur un ciel bleu au lieu du vert foncé (contraste chaud sur froid : la graine dorée glisse vers le soleil). Barre système et écran de démarrage en crème.</w:t>
+      </w:r>
+    </w:p>
+    <w:p>
+      <w:pPr>
+        <w:pStyle w:val="Heading2"/>
+      </w:pPr>
+      <w:r>
+        <w:t xml:space="preserve">51.3 Ce qui a été simplifié</w:t>
+      </w:r>
+    </w:p>
+    <w:p>
+      <w:pPr>
+        <w:pStyle w:val="ListBullet"/>
+      </w:pPr>
+      <w:r>
+        <w:t xml:space="preserve">Chaque mécanique se reconnaît par sa forme et son symbole, même sans les couleurs (vérifié en niveaux de gris, deutéranopie, protanopie) : mur en briques, rocher en galet ◆, glace ❄, portails en spirale, flèches de sens unique, interrupteur ◉, porte à barreaux ▥ (ouverte : pointillés), cible en fleur-soleil rose, graine en bille brillante.</w:t>
+      </w:r>
+    </w:p>
+    <w:p>
+      <w:pPr>
+        <w:pStyle w:val="ListBullet"/>
+      </w:pPr>
+      <w:r>
+        <w:t xml:space="preserve">Aide : une carte par mécanique déjà rencontrée ; les autres tiennent en une seule carte « N surprises à découvrir ».</w:t>
+      </w:r>
+    </w:p>
+    <w:p>
+      <w:pPr>
+        <w:pStyle w:val="ListBullet"/>
+      </w:pPr>
+      <w:r>
+        <w:t xml:space="preserve">Victoire : les succès gagnés sont regroupés en une seule puce ; cinq puces au plus.</w:t>
+      </w:r>
+    </w:p>
+    <w:p>
+      <w:pPr>
+        <w:pStyle w:val="ListBullet"/>
+      </w:pPr>
+      <w:r>
+        <w:t xml:space="preserve">Profil : statistiques dédoublonnées en une seule grille. Page JOUER : cartes secondaires rangées en grille de deux.</w:t>
+      </w:r>
+    </w:p>
+    <w:p>
+      <w:pPr>
+        <w:pStyle w:val="Heading2"/>
+      </w:pPr>
+      <w:r>
+        <w:t xml:space="preserve">51.4 Écran par écran</w:t>
+      </w:r>
+    </w:p>
+    <w:p>
+      <w:pPr>
+        <w:pStyle w:val="ListBullet"/>
+      </w:pPr>
+      <w:r>
+        <w:t xml:space="preserve">Lancement : fond ensoleillé, logo redessiné (dalle, mur, fleur-soleil, graine), grand bouton corail.</w:t>
+      </w:r>
+    </w:p>
+    <w:p>
+      <w:pPr>
+        <w:pStyle w:val="ListBullet"/>
+      </w:pPr>
+      <w:r>
+        <w:t xml:space="preserve">Barre d'onglets : barre blanche arrondie, JOUER en bouton corail au centre, onglet actif surligné, icônes en deux tons.</w:t>
+      </w:r>
+    </w:p>
+    <w:p>
+      <w:pPr>
+        <w:pStyle w:val="ListBullet"/>
+      </w:pPr>
+      <w:r>
+        <w:t xml:space="preserve">Plateau : bac en bois clair aux couleurs du monde, dalles en relief ; à la victoire, éclosion de pétales et d'étincelles et halo du plateau (rien si animations réduites).</w:t>
+      </w:r>
+    </w:p>
+    <w:p>
+      <w:pPr>
+        <w:pStyle w:val="ListBullet"/>
+      </w:pPr>
+      <w:r>
+        <w:t xml:space="preserve">Les 8 mondes, tous en plein jour avec leur palette : verger, canyon de terre cuite, labyrinthe de haies, matin de neige, grotte de cristal, lagon, heure dorée, crépuscule étoilé. Les couleurs des mécaniques ne changent jamais d'un monde à l'autre.</w:t>
+      </w:r>
+    </w:p>
+    <w:p>
+      <w:pPr>
+        <w:pStyle w:val="ListBullet"/>
+      </w:pPr>
+      <w:r>
+        <w:t xml:space="preserve">Victoire, carte des mondes, Marché, Collection, Jardin, Profil, Paramètres, Aide, bulles de Germain, carte de partage : même matière, mêmes couleurs, contrastes vérifiés.</w:t>
+      </w:r>
+    </w:p>
+    <w:p>
+      <w:pPr>
+        <w:pStyle w:val="Heading2"/>
+      </w:pPr>
+      <w:r>
+        <w:t xml:space="preserve">51.5 Cosmétiques</w:t>
+      </w:r>
+    </w:p>
+    <w:p>
+      <w:pPr>
+        <w:pStyle w:val="ListBullet"/>
+      </w:pPr>
+      <w:r>
+        <w:t xml:space="preserve">Chaque graine a désormais sa matière (jade, saphir taillé, cœur de rubis, géode d'améthyste, bille de chrome, braise, givre, aurore, nuit…).</w:t>
+      </w:r>
+    </w:p>
+    <w:p>
+      <w:pPr>
+        <w:pStyle w:val="ListBullet"/>
+      </w:pPr>
+      <w:r>
+        <w:t xml:space="preserve">Ajouts : cinq graines (Pastèque, Coccinelle, Rayon de miel, Bulle irisée, Petit soleil), trois traînées (Bulles, Notes, Arc-en-ciel), deux effets de victoire (Papillons, Feu d'artifice), deux cadres (Lagon, Couronne de fleurs).</w:t>
+      </w:r>
+    </w:p>
+    <w:p>
+      <w:pPr>
+        <w:pStyle w:val="ListBullet"/>
+      </w:pPr>
+      <w:r>
+        <w:t xml:space="preserve">Raretés lisibles : commun, rare (ciel), épique (baie), légendaire (soleil), avec des rayons sur la scène d'essai des objets épiques et légendaires.</w:t>
+      </w:r>
+    </w:p>
+    <w:p>
+      <w:pPr>
+        <w:pStyle w:val="ListBullet"/>
+      </w:pPr>
+      <w:r>
+        <w:t xml:space="preserve">Aucune perte : les identifiants sont conservés, l'objet équipé reste équipé, les pièces sont intactes. Les anciennes sauvegardes reçoivent une seule annonce du nouveau look.</w:t>
+      </w:r>
+    </w:p>
+    <w:p>
+      <w:pPr>
+        <w:pStyle w:val="Heading2"/>
+      </w:pPr>
+      <w:r>
+        <w:t xml:space="preserve">51.6 Rétention, son, tutoriel</w:t>
+      </w:r>
+    </w:p>
+    <w:p>
+      <w:pPr>
+        <w:pStyle w:val="ListBullet"/>
+      </w:pPr>
+      <w:r>
+        <w:t xml:space="preserve">Le chemin parfait (audit §7) : après une victoire en moins de 3 étoiles, le jeu rejoue la solution optimale case par case, puis rend la main (« À toi : N coups pour ★★★ ! »). L'échec devient une envie de rejouer (J1) et la maîtrise s'apprend (J7).</w:t>
+      </w:r>
+    </w:p>
+    <w:p>
+      <w:pPr>
+        <w:pStyle w:val="ListBullet"/>
+      </w:pPr>
+      <w:r>
+        <w:t xml:space="preserve">Choix assumé : pas de nouvelle couche (modificateurs de la semaine, mode « par exact ») ; on a préféré simplifier plutôt qu'empiler.</w:t>
+      </w:r>
+    </w:p>
+    <w:p>
+      <w:pPr>
+        <w:pStyle w:val="ListBullet"/>
+      </w:pPr>
+      <w:r>
+        <w:t xml:space="preserve">Son : un timbre « pâte » pour l'interface, des étincelles de verre pour la victoire, sur le même bus que la musique.</w:t>
+      </w:r>
+    </w:p>
+    <w:p>
+      <w:pPr>
+        <w:pStyle w:val="ListBullet"/>
+      </w:pPr>
+      <w:r>
+        <w:t xml:space="preserve">Tutoriel : visites du Marché (le joueur ouvre lui-même son premier cadeau) et du Profil (missions, saison et succès réunis) ; l'ancienne visite des succès disparaît ; aide unique pour le chemin parfait. Toujours court, passable, rejouable depuis les Paramètres.</w:t>
+      </w:r>
+    </w:p>
+    <w:p>
+      <w:pPr>
+        <w:pStyle w:val="Heading2"/>
+      </w:pPr>
+      <w:r>
+        <w:t xml:space="preserve">51.7 Qualité</w:t>
+      </w:r>
+    </w:p>
+    <w:p>
+      <w:pPr>
+        <w:pStyle w:val="ListBullet"/>
+      </w:pPr>
+      <w:r>
+        <w:t xml:space="preserve">Tests : logique pure (6 707 vérifications), jsdom avec de vrais événements clavier et tactiles (141, dont le chemin parfait et une sauvegarde d'avant la refonte), parcours complet dans Chromium (84) et tutoriel (65) ; aucune erreur console.</w:t>
+      </w:r>
+    </w:p>
+    <w:p>
+      <w:pPr>
+        <w:pStyle w:val="ListBullet"/>
+      </w:pPr>
+      <w:r>
+        <w:t xml:space="preserve">Performance (processeur ralenti ×4) : 57 à 60 images/s au repos, 45 à 58 en glissant entre les pages. Les boutons qui respirent animent leur ombre, jamais leur position.</w:t>
+      </w:r>
+    </w:p>
+    <w:p>
+      <w:pPr>
+        <w:pStyle w:val="ListBullet"/>
+      </w:pPr>
+      <w:r>
+        <w:t xml:space="preserve">Accessibilité : contrastes du texte vérifiés, cibles tactiles de 44 px au moins, animations réduites respectées, annonces vocales inchangées.</w:t>
+      </w:r>
+    </w:p>
+    <w:p>
+      <w:pPr>
+        <w:pStyle w:val="Heading2"/>
+      </w:pPr>
+      <w:r>
+        <w:t xml:space="preserve">51.8 Ce qui reste à faire</w:t>
+      </w:r>
+    </w:p>
+    <w:p>
+      <w:pPr>
+        <w:pStyle w:val="ListBullet"/>
+      </w:pPr>
+      <w:r>
+        <w:t xml:space="preserve">Voir la refonte sur de vrais téléphones (écrans OLED, plein soleil) et la montrer à de vrais joueurs, enfants compris.</w:t>
+      </w:r>
+    </w:p>
+    <w:p>
+      <w:pPr>
+        <w:pStyle w:val="ListBullet"/>
+      </w:pPr>
+      <w:r>
+        <w:t xml:space="preserve">Un illustrateur pour l'icône, Germain, les plantes et les animaux du jardin.</w:t>
+      </w:r>
+    </w:p>
+    <w:p>
+      <w:pPr>
+        <w:pStyle w:val="ListBullet"/>
+      </w:pPr>
+      <w:r>
+        <w:t xml:space="preserve">Si les tests le demandent : modificateurs de la semaine et mode « par exact ».</w:t>
+      </w:r>
+    </w:p>
+    <w:p>
       <w:r>
         <w:t xml:space="preserve"/>
       </w:r>
     </w:p>
     <w:p>
       <w:r>
-        <w:t xml:space="preserve">Document maître — Seedrift (ex-BlockCraft Daily) — version de travail 1.2 (mise à jour d’octobre 2026 : navigation et rendez-vous)</w:t>
+        <w:t xml:space="preserve">Document maître — Seedrift (ex-BlockCraft Daily) — version de travail 1.3 (mise à jour d’octobre 2026 : refonte du design « Verger au soleil »)</w:t>
       </w:r>
     </w:p>
     <w:sectPr>

</xml_diff>

<commit_message>
Passe globale : minuit UTC, stockage, petits écrans, aides, docs et Blueprint §52
- Défi commencé avant minuit (UTC) et gagné après : compté pour son jour,
  série créditée sans saut (streakCreditDay), défi suivant toujours à jouer.
- Stockage plein ou interdit : testé, jeu jouable sans erreur.
- 320 px et paysage : en-tête, cartes et HUD sans débordement, plateau
  jouable à l'horizontale.
- Aides uniques : Terres sauvages, bouquets, « À demain ».
- Code mort retiré (beep, sfxMove).
- Docs (CLAUDE.md, PRODUCTION_PROGRESS §4h, ONBOARDING) et Master
  Blueprint §52 (version 1.4).

Co-Authored-By: Claude Opus 5.5 <noreply@anthropic.com>
Claude-Session: https://claude.ai/code/session_01W5hjjDD9vqQD8t6eQqX2ek
</commit_message>
<xml_diff>
--- a/docs/BlockCraft_Daily_Master_Blueprint.docx
+++ b/docs/BlockCraft_Daily_Master_Blueprint.docx
@@ -10184,13 +10184,218 @@
       </w:r>
     </w:p>
     <w:p>
+      <w:pPr>
+        <w:pStyle w:val="Heading1"/>
+      </w:pPr>
+      <w:r>
+        <w:t xml:space="preserve">52. MISE À JOUR D'OCTOBRE 2026 — PASSE D'AMÉLIORATION GLOBALE ET TERRES SAUVAGES</w:t>
+      </w:r>
+    </w:p>
+    <w:p>
+      <w:r>
+        <w:t xml:space="preserve">Méthode : un joueur simulé (Chromium, vrais clics) sur les 5 premières minutes et le lendemain, puis 30 jours d'un joueur régulier simulés dans jsdom. Chaque constat est devenu un test. Cette section complète les §17 (tutoriel), §9 (méta-progression), §11 (économie) et §20 (game feel).</w:t>
+      </w:r>
+    </w:p>
+    <w:p>
+      <w:pPr>
+        <w:pStyle w:val="Heading2"/>
+      </w:pPr>
+      <w:r>
+        <w:t xml:space="preserve">52.1 Problèmes trouvés au playtest et corrections</w:t>
+      </w:r>
+    </w:p>
+    <w:p>
+      <w:pPr>
+        <w:pStyle w:val="ListBullet"/>
+      </w:pPr>
+      <w:r>
+        <w:t xml:space="preserve">Bloquant : à la visite guidée du Jardin, le projecteur faisait glisser la piste des pages et la bulle de Germain cachait le bouton : le joueur restait sous l'écran assombri. Corrigé (piste qui ne défile jamais, cible centrée, bulle du côté libre).</w:t>
+      </w:r>
+    </w:p>
+    <w:p>
+      <w:pPr>
+        <w:pStyle w:val="ListBullet"/>
+      </w:pPr>
+      <w:r>
+        <w:t xml:space="preserve">Entrée trop lente (1er coup à 7,9 s) : « Jouer » lance désormais le niveau 1 directement, Germain s'y présente en une bulle. 1er coup à 2,3 s, 1re victoire à 8,4 s au lieu de 17 s.</w:t>
+      </w:r>
+    </w:p>
+    <w:p>
+      <w:pPr>
+        <w:pStyle w:val="ListBullet"/>
+      </w:pPr>
+      <w:r>
+        <w:t xml:space="preserve">Le jardin passait inaperçu : bouton « Réveiller le jardin » sur l'écran de victoire, puis retour au niveau suivant.</w:t>
+      </w:r>
+    </w:p>
+    <w:p>
+      <w:pPr>
+        <w:pStyle w:val="ListBullet"/>
+      </w:pPr>
+      <w:r>
+        <w:t xml:space="preserve">Pas de sortie de la victoire sans bouton retour : bouton ⌂. Fête de rang qui s'ouvrait au milieu du Marché : seulement sur JOUER.</w:t>
+      </w:r>
+    </w:p>
+    <w:p>
+      <w:pPr>
+        <w:pStyle w:val="ListBullet"/>
+      </w:pPr>
+      <w:r>
+        <w:t xml:space="preserve">Pastilles saturées (« 9+ » coincé) : une action = une pastille.</w:t>
+      </w:r>
+    </w:p>
+    <w:p>
+      <w:pPr>
+        <w:pStyle w:val="ListBullet"/>
+      </w:pPr>
+      <w:r>
+        <w:t xml:space="preserve">Défi du jour gagné après minuit UTC compté pour le lendemain : il compte pour son jour, la série reste juste.</w:t>
+      </w:r>
+    </w:p>
+    <w:p>
+      <w:pPr>
+        <w:pStyle w:val="ListBullet"/>
+      </w:pPr>
+      <w:r>
+        <w:t xml:space="preserve">Petits écrans (320 px) et téléphone à l'horizontale : mise en page corrigée, plateau jouable.</w:t>
+      </w:r>
+    </w:p>
+    <w:p>
+      <w:pPr>
+        <w:pStyle w:val="Heading2"/>
+      </w:pPr>
+      <w:r>
+        <w:t xml:space="preserve">52.2 Les 5 premières minutes</w:t>
+      </w:r>
+    </w:p>
+    <w:p>
+      <w:pPr>
+        <w:pStyle w:val="ListBullet"/>
+      </w:pPr>
+      <w:r>
+        <w:t xml:space="preserve">Jouer en 2 secondes, comprendre sans lire (doigt fantôme, une bulle à la fois), 1re grosse récompense au bout de 2 niveaux (le jardin se réveille), puis la carte « À demain ! » : cadeau suivant, défi de demain, série, heures avant le nouveau jour.</w:t>
+      </w:r>
+    </w:p>
+    <w:p>
+      <w:pPr>
+        <w:pStyle w:val="Heading2"/>
+      </w:pPr>
+      <w:r>
+        <w:t xml:space="preserve">52.3 Game feel</w:t>
+      </w:r>
+    </w:p>
+    <w:p>
+      <w:pPr>
+        <w:pStyle w:val="ListBullet"/>
+      </w:pPr>
+      <w:r>
+        <w:t xml:space="preserve">Glissement dont la durée suit la distance, avec décélération ; choc du plateau, « toc » sourd et vibration proportionnels aux longs glissements ; le coup part pendant le geste, sans attendre le lever du doigt, et une seule fois par contact.</w:t>
+      </w:r>
+    </w:p>
+    <w:p>
+      <w:pPr>
+        <w:pStyle w:val="Heading2"/>
+      </w:pPr>
+      <w:r>
+        <w:t xml:space="preserve">52.4 Équilibrage et progression</w:t>
+      </w:r>
+    </w:p>
+    <w:p>
+      <w:pPr>
+        <w:pStyle w:val="ListBullet"/>
+      </w:pPr>
+      <w:r>
+        <w:t xml:space="preserve">Les Terres sauvages : la campagne continue sans fin après le Monde 8. Des mondes de 8 niveaux générés, les mêmes pour tous, chacun avec sa palette et sa mécanique vedette (qui compte vraiment), difficulté en dents de scie puis légèrement croissante par tour, plafonnée. Chaque plateau est vérifié par le solveur du jeu et par un second solveur indépendant.</w:t>
+      </w:r>
+    </w:p>
+    <w:p>
+      <w:pPr>
+        <w:pStyle w:val="ListBullet"/>
+      </w:pPr>
+      <w:r>
+        <w:t xml:space="preserve">Économie calibrée par simulation : le défi du jour ne rapporte des pièces qu'une fois par jour (fin des pièces à volonté) ; passe de saison sur environ 3 semaines au lieu de 8 jours ; prix des cosmétiques ×1,7 (catalogue complet vers J33 au lieu de J14) ; un objectif d'achat toujours visible.</w:t>
+      </w:r>
+    </w:p>
+    <w:p>
+      <w:pPr>
+        <w:pStyle w:val="ListBullet"/>
+      </w:pPr>
+      <w:r>
+        <w:t xml:space="preserve">La rosée reste utile quand le jardin est entièrement réveillé : elle cueille des bouquets (pièces et XP de saison).</w:t>
+      </w:r>
+    </w:p>
+    <w:p>
+      <w:pPr>
+        <w:pStyle w:val="Heading2"/>
+      </w:pPr>
+      <w:r>
+        <w:t xml:space="preserve">52.5 Qualité</w:t>
+      </w:r>
+    </w:p>
+    <w:p>
+      <w:pPr>
+        <w:pStyle w:val="ListBullet"/>
+      </w:pPr>
+      <w:r>
+        <w:t xml:space="preserve">Tests : logique pure 6 730 (dont le BFS indépendant sur les 60 niveaux, 80 niveaux sauvages, le Sentier et les défis), jsdom 177, parcours Chromium 82, tutoriel 62 ; aucune erreur console. Stockage plein ou interdit : le jeu reste jouable. 100 niveaux d'affilée : mémoire stable.</w:t>
+      </w:r>
+    </w:p>
+    <w:p>
+      <w:pPr>
+        <w:pStyle w:val="Heading2"/>
+      </w:pPr>
+      <w:r>
+        <w:t xml:space="preserve">52.6 Prochaines améliorations les plus prometteuses</w:t>
+      </w:r>
+    </w:p>
+    <w:p>
+      <w:pPr>
+        <w:pStyle w:val="ListBullet"/>
+      </w:pPr>
+      <w:r>
+        <w:t xml:space="preserve">Tests avec de vrais joueurs (5 à 10) : mesurer le temps jusqu'au 1er coup, l'usage du bouton « Réveiller le jardin », le retour à J1 et J7.</w:t>
+      </w:r>
+    </w:p>
+    <w:p>
+      <w:pPr>
+        <w:pStyle w:val="ListBullet"/>
+      </w:pPr>
+      <w:r>
+        <w:t xml:space="preserve">Rappels de retour (notifications) via un service de push : la carte « À demain » donne le contenu, il manque le canal.</w:t>
+      </w:r>
+    </w:p>
+    <w:p>
+      <w:pPr>
+        <w:pStyle w:val="ListBullet"/>
+      </w:pPr>
+      <w:r>
+        <w:t xml:space="preserve">Événements de la semaine dans les Terres sauvages (une mécanique à l'honneur), sans nouveau système.</w:t>
+      </w:r>
+    </w:p>
+    <w:p>
+      <w:pPr>
+        <w:pStyle w:val="ListBullet"/>
+      </w:pPr>
+      <w:r>
+        <w:t xml:space="preserve">Réglage fin de l'économie avec les vraies données (pièces gagnées par jour, premier achat).</w:t>
+      </w:r>
+    </w:p>
+    <w:p>
+      <w:pPr>
+        <w:pStyle w:val="ListBullet"/>
+      </w:pPr>
+      <w:r>
+        <w:t xml:space="preserve">Un illustrateur pour Germain, les plantes et les décors des Terres sauvages.</w:t>
+      </w:r>
+    </w:p>
+    <w:p>
       <w:r>
         <w:t xml:space="preserve"/>
       </w:r>
     </w:p>
     <w:p>
       <w:r>
-        <w:t xml:space="preserve">Document maître — Seedrift (ex-BlockCraft Daily) — version de travail 1.3 (mise à jour d’octobre 2026 : refonte du design « Verger au soleil »)</w:t>
+        <w:t xml:space="preserve">Document maître — Seedrift (ex-BlockCraft Daily) — version de travail 1.4 (mise à jour d’octobre 2026 : passe d’amélioration globale, Terres sauvages)</w:t>
       </w:r>
     </w:p>
     <w:sectPr>

</xml_diff>